<commit_message>
Board badge and the ROCK's health over SNMP: temperature, fan, uptime, load, free space
Page: a badge like the Receiver's, '38°C fan 50%', amber from 60 C, red
from 80 C. /api/status carries it as board.
SNMP: lynxCpuTemp now from soc-thermal (thermal_zone0 is not always it);
new lynxFanPercent (15), lynxUptime (16), lynxCpuLoad (17) and
lynxDiskFreeMB (18). MIB revision 2026-10-23, smilint clean. Monitoring
Guide 1.1: the new objects, Home Assistant sensors and alarms.

Co-Authored-By: Claude Opus 5.5 <noreply@anthropic.com>
Claude-Session: https://claude.ai/code/session_01Ah3RWauccyreTdigt69pB9
</commit_message>
<xml_diff>
--- a/docs/lynx_tx_monitoring_guide.docx
+++ b/docs/lynx_tx_monitoring_guide.docx
@@ -35,7 +35,7 @@
         <w:rPr>
           <w:b/>
         </w:rPr>
-        <w:t>Version 1.0  ·  G8YTZ / EI3IOB  ·  October 2026</w:t>
+        <w:t>Version 1.1  ·  G8YTZ / EI3IOB  ·  October 2026</w:t>
       </w:r>
     </w:p>
     <w:p>
@@ -336,10 +336,10 @@
         </w:tblBorders>
       </w:tblPr>
       <w:tblGrid>
-        <w:gridCol w:w="2046"/>
-        <w:gridCol w:w="2611"/>
-        <w:gridCol w:w="2418"/>
-        <w:gridCol w:w="2283"/>
+        <w:gridCol w:w="2009"/>
+        <w:gridCol w:w="2537"/>
+        <w:gridCol w:w="2411"/>
+        <w:gridCol w:w="2401"/>
       </w:tblGrid>
       <w:tr>
         <w:trPr>
@@ -347,8 +347,8 @@
         </w:trPr>
         <w:tc>
           <w:tcPr>
-            <w:tcW w:type="dxa" w:w="2046"/>
-            <w:tcW w:type="dxa" w:w="2046"/>
+            <w:tcW w:type="dxa" w:w="2009"/>
+            <w:tcW w:type="dxa" w:w="2009"/>
             <w:shd w:fill="2C3E50" w:val="clear"/>
           </w:tcPr>
           <w:p>
@@ -381,8 +381,8 @@
         </w:tc>
         <w:tc>
           <w:tcPr>
-            <w:tcW w:type="dxa" w:w="2611"/>
-            <w:tcW w:type="dxa" w:w="2611"/>
+            <w:tcW w:type="dxa" w:w="2537"/>
+            <w:tcW w:type="dxa" w:w="2537"/>
             <w:shd w:fill="2C3E50" w:val="clear"/>
           </w:tcPr>
           <w:p>
@@ -398,8 +398,8 @@
         </w:tc>
         <w:tc>
           <w:tcPr>
-            <w:tcW w:type="dxa" w:w="2418"/>
-            <w:tcW w:type="dxa" w:w="2418"/>
+            <w:tcW w:type="dxa" w:w="2411"/>
+            <w:tcW w:type="dxa" w:w="2411"/>
             <w:shd w:fill="2C3E50" w:val="clear"/>
           </w:tcPr>
           <w:p>
@@ -415,8 +415,8 @@
         </w:tc>
         <w:tc>
           <w:tcPr>
-            <w:tcW w:type="dxa" w:w="2283"/>
-            <w:tcW w:type="dxa" w:w="2283"/>
+            <w:tcW w:type="dxa" w:w="2401"/>
+            <w:tcW w:type="dxa" w:w="2401"/>
             <w:shd w:fill="2C3E50" w:val="clear"/>
           </w:tcPr>
           <w:p>
@@ -434,8 +434,8 @@
       <w:tr>
         <w:tc>
           <w:tcPr>
-            <w:tcW w:type="dxa" w:w="2046"/>
-            <w:tcW w:type="dxa" w:w="2046"/>
+            <w:tcW w:type="dxa" w:w="2009"/>
+            <w:tcW w:type="dxa" w:w="2009"/>
           </w:tcPr>
           <w:p>
             <w:r>
@@ -449,8 +449,8 @@
         </w:tc>
         <w:tc>
           <w:tcPr>
-            <w:tcW w:type="dxa" w:w="2611"/>
-            <w:tcW w:type="dxa" w:w="2611"/>
+            <w:tcW w:type="dxa" w:w="2537"/>
+            <w:tcW w:type="dxa" w:w="2537"/>
           </w:tcPr>
           <w:p>
             <w:r>
@@ -463,8 +463,8 @@
         </w:tc>
         <w:tc>
           <w:tcPr>
-            <w:tcW w:type="dxa" w:w="2418"/>
-            <w:tcW w:type="dxa" w:w="2418"/>
+            <w:tcW w:type="dxa" w:w="2411"/>
+            <w:tcW w:type="dxa" w:w="2411"/>
           </w:tcPr>
           <w:p>
             <w:r>
@@ -477,8 +477,8 @@
         </w:tc>
         <w:tc>
           <w:tcPr>
-            <w:tcW w:type="dxa" w:w="2283"/>
-            <w:tcW w:type="dxa" w:w="2283"/>
+            <w:tcW w:type="dxa" w:w="2401"/>
+            <w:tcW w:type="dxa" w:w="2401"/>
           </w:tcPr>
           <w:p>
             <w:r>
@@ -493,8 +493,8 @@
       <w:tr>
         <w:tc>
           <w:tcPr>
-            <w:tcW w:type="dxa" w:w="2046"/>
-            <w:tcW w:type="dxa" w:w="2046"/>
+            <w:tcW w:type="dxa" w:w="2009"/>
+            <w:tcW w:type="dxa" w:w="2009"/>
           </w:tcPr>
           <w:p>
             <w:r>
@@ -508,8 +508,8 @@
         </w:tc>
         <w:tc>
           <w:tcPr>
-            <w:tcW w:type="dxa" w:w="2611"/>
-            <w:tcW w:type="dxa" w:w="2611"/>
+            <w:tcW w:type="dxa" w:w="2537"/>
+            <w:tcW w:type="dxa" w:w="2537"/>
           </w:tcPr>
           <w:p>
             <w:r>
@@ -522,8 +522,8 @@
         </w:tc>
         <w:tc>
           <w:tcPr>
-            <w:tcW w:type="dxa" w:w="2418"/>
-            <w:tcW w:type="dxa" w:w="2418"/>
+            <w:tcW w:type="dxa" w:w="2411"/>
+            <w:tcW w:type="dxa" w:w="2411"/>
           </w:tcPr>
           <w:p>
             <w:r>
@@ -536,8 +536,8 @@
         </w:tc>
         <w:tc>
           <w:tcPr>
-            <w:tcW w:type="dxa" w:w="2283"/>
-            <w:tcW w:type="dxa" w:w="2283"/>
+            <w:tcW w:type="dxa" w:w="2401"/>
+            <w:tcW w:type="dxa" w:w="2401"/>
           </w:tcPr>
           <w:p>
             <w:r>
@@ -552,8 +552,8 @@
       <w:tr>
         <w:tc>
           <w:tcPr>
-            <w:tcW w:type="dxa" w:w="2046"/>
-            <w:tcW w:type="dxa" w:w="2046"/>
+            <w:tcW w:type="dxa" w:w="2009"/>
+            <w:tcW w:type="dxa" w:w="2009"/>
           </w:tcPr>
           <w:p>
             <w:r>
@@ -567,8 +567,8 @@
         </w:tc>
         <w:tc>
           <w:tcPr>
-            <w:tcW w:type="dxa" w:w="2611"/>
-            <w:tcW w:type="dxa" w:w="2611"/>
+            <w:tcW w:type="dxa" w:w="2537"/>
+            <w:tcW w:type="dxa" w:w="2537"/>
           </w:tcPr>
           <w:p>
             <w:r>
@@ -581,8 +581,8 @@
         </w:tc>
         <w:tc>
           <w:tcPr>
-            <w:tcW w:type="dxa" w:w="2418"/>
-            <w:tcW w:type="dxa" w:w="2418"/>
+            <w:tcW w:type="dxa" w:w="2411"/>
+            <w:tcW w:type="dxa" w:w="2411"/>
           </w:tcPr>
           <w:p>
             <w:r>
@@ -595,8 +595,8 @@
         </w:tc>
         <w:tc>
           <w:tcPr>
-            <w:tcW w:type="dxa" w:w="2283"/>
-            <w:tcW w:type="dxa" w:w="2283"/>
+            <w:tcW w:type="dxa" w:w="2401"/>
+            <w:tcW w:type="dxa" w:w="2401"/>
           </w:tcPr>
           <w:p>
             <w:r>
@@ -611,8 +611,8 @@
       <w:tr>
         <w:tc>
           <w:tcPr>
-            <w:tcW w:type="dxa" w:w="2046"/>
-            <w:tcW w:type="dxa" w:w="2046"/>
+            <w:tcW w:type="dxa" w:w="2009"/>
+            <w:tcW w:type="dxa" w:w="2009"/>
           </w:tcPr>
           <w:p>
             <w:r>
@@ -626,8 +626,8 @@
         </w:tc>
         <w:tc>
           <w:tcPr>
-            <w:tcW w:type="dxa" w:w="2611"/>
-            <w:tcW w:type="dxa" w:w="2611"/>
+            <w:tcW w:type="dxa" w:w="2537"/>
+            <w:tcW w:type="dxa" w:w="2537"/>
           </w:tcPr>
           <w:p>
             <w:r>
@@ -640,8 +640,8 @@
         </w:tc>
         <w:tc>
           <w:tcPr>
-            <w:tcW w:type="dxa" w:w="2418"/>
-            <w:tcW w:type="dxa" w:w="2418"/>
+            <w:tcW w:type="dxa" w:w="2411"/>
+            <w:tcW w:type="dxa" w:w="2411"/>
           </w:tcPr>
           <w:p>
             <w:r>
@@ -654,8 +654,8 @@
         </w:tc>
         <w:tc>
           <w:tcPr>
-            <w:tcW w:type="dxa" w:w="2283"/>
-            <w:tcW w:type="dxa" w:w="2283"/>
+            <w:tcW w:type="dxa" w:w="2401"/>
+            <w:tcW w:type="dxa" w:w="2401"/>
           </w:tcPr>
           <w:p>
             <w:r>
@@ -670,8 +670,8 @@
       <w:tr>
         <w:tc>
           <w:tcPr>
-            <w:tcW w:type="dxa" w:w="2046"/>
-            <w:tcW w:type="dxa" w:w="2046"/>
+            <w:tcW w:type="dxa" w:w="2009"/>
+            <w:tcW w:type="dxa" w:w="2009"/>
           </w:tcPr>
           <w:p>
             <w:r>
@@ -685,8 +685,8 @@
         </w:tc>
         <w:tc>
           <w:tcPr>
-            <w:tcW w:type="dxa" w:w="2611"/>
-            <w:tcW w:type="dxa" w:w="2611"/>
+            <w:tcW w:type="dxa" w:w="2537"/>
+            <w:tcW w:type="dxa" w:w="2537"/>
           </w:tcPr>
           <w:p>
             <w:r>
@@ -699,8 +699,8 @@
         </w:tc>
         <w:tc>
           <w:tcPr>
-            <w:tcW w:type="dxa" w:w="2418"/>
-            <w:tcW w:type="dxa" w:w="2418"/>
+            <w:tcW w:type="dxa" w:w="2411"/>
+            <w:tcW w:type="dxa" w:w="2411"/>
           </w:tcPr>
           <w:p>
             <w:r>
@@ -713,8 +713,8 @@
         </w:tc>
         <w:tc>
           <w:tcPr>
-            <w:tcW w:type="dxa" w:w="2283"/>
-            <w:tcW w:type="dxa" w:w="2283"/>
+            <w:tcW w:type="dxa" w:w="2401"/>
+            <w:tcW w:type="dxa" w:w="2401"/>
           </w:tcPr>
           <w:p>
             <w:r>
@@ -729,8 +729,8 @@
       <w:tr>
         <w:tc>
           <w:tcPr>
-            <w:tcW w:type="dxa" w:w="2046"/>
-            <w:tcW w:type="dxa" w:w="2046"/>
+            <w:tcW w:type="dxa" w:w="2009"/>
+            <w:tcW w:type="dxa" w:w="2009"/>
           </w:tcPr>
           <w:p>
             <w:r>
@@ -744,8 +744,8 @@
         </w:tc>
         <w:tc>
           <w:tcPr>
-            <w:tcW w:type="dxa" w:w="2611"/>
-            <w:tcW w:type="dxa" w:w="2611"/>
+            <w:tcW w:type="dxa" w:w="2537"/>
+            <w:tcW w:type="dxa" w:w="2537"/>
           </w:tcPr>
           <w:p>
             <w:r>
@@ -758,8 +758,8 @@
         </w:tc>
         <w:tc>
           <w:tcPr>
-            <w:tcW w:type="dxa" w:w="2418"/>
-            <w:tcW w:type="dxa" w:w="2418"/>
+            <w:tcW w:type="dxa" w:w="2411"/>
+            <w:tcW w:type="dxa" w:w="2411"/>
           </w:tcPr>
           <w:p>
             <w:r>
@@ -772,8 +772,8 @@
         </w:tc>
         <w:tc>
           <w:tcPr>
-            <w:tcW w:type="dxa" w:w="2283"/>
-            <w:tcW w:type="dxa" w:w="2283"/>
+            <w:tcW w:type="dxa" w:w="2401"/>
+            <w:tcW w:type="dxa" w:w="2401"/>
           </w:tcPr>
           <w:p/>
         </w:tc>
@@ -781,8 +781,8 @@
       <w:tr>
         <w:tc>
           <w:tcPr>
-            <w:tcW w:type="dxa" w:w="2046"/>
-            <w:tcW w:type="dxa" w:w="2046"/>
+            <w:tcW w:type="dxa" w:w="2009"/>
+            <w:tcW w:type="dxa" w:w="2009"/>
           </w:tcPr>
           <w:p>
             <w:r>
@@ -796,8 +796,8 @@
         </w:tc>
         <w:tc>
           <w:tcPr>
-            <w:tcW w:type="dxa" w:w="2611"/>
-            <w:tcW w:type="dxa" w:w="2611"/>
+            <w:tcW w:type="dxa" w:w="2537"/>
+            <w:tcW w:type="dxa" w:w="2537"/>
           </w:tcPr>
           <w:p>
             <w:r>
@@ -810,8 +810,8 @@
         </w:tc>
         <w:tc>
           <w:tcPr>
-            <w:tcW w:type="dxa" w:w="2418"/>
-            <w:tcW w:type="dxa" w:w="2418"/>
+            <w:tcW w:type="dxa" w:w="2411"/>
+            <w:tcW w:type="dxa" w:w="2411"/>
           </w:tcPr>
           <w:p>
             <w:r>
@@ -824,8 +824,8 @@
         </w:tc>
         <w:tc>
           <w:tcPr>
-            <w:tcW w:type="dxa" w:w="2283"/>
-            <w:tcW w:type="dxa" w:w="2283"/>
+            <w:tcW w:type="dxa" w:w="2401"/>
+            <w:tcW w:type="dxa" w:w="2401"/>
           </w:tcPr>
           <w:p/>
         </w:tc>
@@ -833,8 +833,8 @@
       <w:tr>
         <w:tc>
           <w:tcPr>
-            <w:tcW w:type="dxa" w:w="2046"/>
-            <w:tcW w:type="dxa" w:w="2046"/>
+            <w:tcW w:type="dxa" w:w="2009"/>
+            <w:tcW w:type="dxa" w:w="2009"/>
           </w:tcPr>
           <w:p>
             <w:r>
@@ -848,8 +848,8 @@
         </w:tc>
         <w:tc>
           <w:tcPr>
-            <w:tcW w:type="dxa" w:w="2611"/>
-            <w:tcW w:type="dxa" w:w="2611"/>
+            <w:tcW w:type="dxa" w:w="2537"/>
+            <w:tcW w:type="dxa" w:w="2537"/>
           </w:tcPr>
           <w:p>
             <w:r>
@@ -862,8 +862,8 @@
         </w:tc>
         <w:tc>
           <w:tcPr>
-            <w:tcW w:type="dxa" w:w="2418"/>
-            <w:tcW w:type="dxa" w:w="2418"/>
+            <w:tcW w:type="dxa" w:w="2411"/>
+            <w:tcW w:type="dxa" w:w="2411"/>
           </w:tcPr>
           <w:p>
             <w:r>
@@ -876,8 +876,8 @@
         </w:tc>
         <w:tc>
           <w:tcPr>
-            <w:tcW w:type="dxa" w:w="2283"/>
-            <w:tcW w:type="dxa" w:w="2283"/>
+            <w:tcW w:type="dxa" w:w="2401"/>
+            <w:tcW w:type="dxa" w:w="2401"/>
           </w:tcPr>
           <w:p/>
         </w:tc>
@@ -885,8 +885,8 @@
       <w:tr>
         <w:tc>
           <w:tcPr>
-            <w:tcW w:type="dxa" w:w="2046"/>
-            <w:tcW w:type="dxa" w:w="2046"/>
+            <w:tcW w:type="dxa" w:w="2009"/>
+            <w:tcW w:type="dxa" w:w="2009"/>
           </w:tcPr>
           <w:p>
             <w:r>
@@ -900,8 +900,8 @@
         </w:tc>
         <w:tc>
           <w:tcPr>
-            <w:tcW w:type="dxa" w:w="2611"/>
-            <w:tcW w:type="dxa" w:w="2611"/>
+            <w:tcW w:type="dxa" w:w="2537"/>
+            <w:tcW w:type="dxa" w:w="2537"/>
           </w:tcPr>
           <w:p>
             <w:r>
@@ -914,8 +914,8 @@
         </w:tc>
         <w:tc>
           <w:tcPr>
-            <w:tcW w:type="dxa" w:w="2418"/>
-            <w:tcW w:type="dxa" w:w="2418"/>
+            <w:tcW w:type="dxa" w:w="2411"/>
+            <w:tcW w:type="dxa" w:w="2411"/>
           </w:tcPr>
           <w:p>
             <w:r>
@@ -928,8 +928,8 @@
         </w:tc>
         <w:tc>
           <w:tcPr>
-            <w:tcW w:type="dxa" w:w="2283"/>
-            <w:tcW w:type="dxa" w:w="2283"/>
+            <w:tcW w:type="dxa" w:w="2401"/>
+            <w:tcW w:type="dxa" w:w="2401"/>
           </w:tcPr>
           <w:p>
             <w:r>
@@ -944,8 +944,8 @@
       <w:tr>
         <w:tc>
           <w:tcPr>
-            <w:tcW w:type="dxa" w:w="2046"/>
-            <w:tcW w:type="dxa" w:w="2046"/>
+            <w:tcW w:type="dxa" w:w="2009"/>
+            <w:tcW w:type="dxa" w:w="2009"/>
           </w:tcPr>
           <w:p>
             <w:r>
@@ -959,8 +959,8 @@
         </w:tc>
         <w:tc>
           <w:tcPr>
-            <w:tcW w:type="dxa" w:w="2611"/>
-            <w:tcW w:type="dxa" w:w="2611"/>
+            <w:tcW w:type="dxa" w:w="2537"/>
+            <w:tcW w:type="dxa" w:w="2537"/>
           </w:tcPr>
           <w:p>
             <w:r>
@@ -973,8 +973,8 @@
         </w:tc>
         <w:tc>
           <w:tcPr>
-            <w:tcW w:type="dxa" w:w="2418"/>
-            <w:tcW w:type="dxa" w:w="2418"/>
+            <w:tcW w:type="dxa" w:w="2411"/>
+            <w:tcW w:type="dxa" w:w="2411"/>
           </w:tcPr>
           <w:p>
             <w:r>
@@ -987,8 +987,8 @@
         </w:tc>
         <w:tc>
           <w:tcPr>
-            <w:tcW w:type="dxa" w:w="2283"/>
-            <w:tcW w:type="dxa" w:w="2283"/>
+            <w:tcW w:type="dxa" w:w="2401"/>
+            <w:tcW w:type="dxa" w:w="2401"/>
           </w:tcPr>
           <w:p>
             <w:r>
@@ -1003,8 +1003,8 @@
       <w:tr>
         <w:tc>
           <w:tcPr>
-            <w:tcW w:type="dxa" w:w="2046"/>
-            <w:tcW w:type="dxa" w:w="2046"/>
+            <w:tcW w:type="dxa" w:w="2009"/>
+            <w:tcW w:type="dxa" w:w="2009"/>
           </w:tcPr>
           <w:p>
             <w:r>
@@ -1018,8 +1018,8 @@
         </w:tc>
         <w:tc>
           <w:tcPr>
-            <w:tcW w:type="dxa" w:w="2611"/>
-            <w:tcW w:type="dxa" w:w="2611"/>
+            <w:tcW w:type="dxa" w:w="2537"/>
+            <w:tcW w:type="dxa" w:w="2537"/>
           </w:tcPr>
           <w:p>
             <w:r>
@@ -1032,8 +1032,8 @@
         </w:tc>
         <w:tc>
           <w:tcPr>
-            <w:tcW w:type="dxa" w:w="2418"/>
-            <w:tcW w:type="dxa" w:w="2418"/>
+            <w:tcW w:type="dxa" w:w="2411"/>
+            <w:tcW w:type="dxa" w:w="2411"/>
           </w:tcPr>
           <w:p>
             <w:r>
@@ -1046,8 +1046,8 @@
         </w:tc>
         <w:tc>
           <w:tcPr>
-            <w:tcW w:type="dxa" w:w="2283"/>
-            <w:tcW w:type="dxa" w:w="2283"/>
+            <w:tcW w:type="dxa" w:w="2401"/>
+            <w:tcW w:type="dxa" w:w="2401"/>
           </w:tcPr>
           <w:p>
             <w:r>
@@ -1062,8 +1062,8 @@
       <w:tr>
         <w:tc>
           <w:tcPr>
-            <w:tcW w:type="dxa" w:w="2046"/>
-            <w:tcW w:type="dxa" w:w="2046"/>
+            <w:tcW w:type="dxa" w:w="2009"/>
+            <w:tcW w:type="dxa" w:w="2009"/>
           </w:tcPr>
           <w:p>
             <w:r>
@@ -1077,8 +1077,8 @@
         </w:tc>
         <w:tc>
           <w:tcPr>
-            <w:tcW w:type="dxa" w:w="2611"/>
-            <w:tcW w:type="dxa" w:w="2611"/>
+            <w:tcW w:type="dxa" w:w="2537"/>
+            <w:tcW w:type="dxa" w:w="2537"/>
           </w:tcPr>
           <w:p>
             <w:r>
@@ -1091,29 +1091,29 @@
         </w:tc>
         <w:tc>
           <w:tcPr>
-            <w:tcW w:type="dxa" w:w="2418"/>
-            <w:tcW w:type="dxa" w:w="2418"/>
-          </w:tcPr>
-          <w:p>
-            <w:r>
-              <w:rPr>
-                <w:sz w:val="20"/>
-              </w:rPr>
-              <w:t>tenths of a °C</w:t>
-            </w:r>
-          </w:p>
-        </w:tc>
-        <w:tc>
-          <w:tcPr>
-            <w:tcW w:type="dxa" w:w="2283"/>
-            <w:tcW w:type="dxa" w:w="2283"/>
-          </w:tcPr>
-          <w:p>
-            <w:r>
-              <w:rPr>
-                <w:sz w:val="20"/>
-              </w:rPr>
-              <w:t>above 850 (85 °C)</w:t>
+            <w:tcW w:type="dxa" w:w="2411"/>
+            <w:tcW w:type="dxa" w:w="2411"/>
+          </w:tcPr>
+          <w:p>
+            <w:r>
+              <w:rPr>
+                <w:sz w:val="20"/>
+              </w:rPr>
+              <w:t>tenths of a °C (held at about 400 by the fan control)</w:t>
+            </w:r>
+          </w:p>
+        </w:tc>
+        <w:tc>
+          <w:tcPr>
+            <w:tcW w:type="dxa" w:w="2401"/>
+            <w:tcW w:type="dxa" w:w="2401"/>
+          </w:tcPr>
+          <w:p>
+            <w:r>
+              <w:rPr>
+                <w:sz w:val="20"/>
+              </w:rPr>
+              <w:t>above 600 (60 °C): the fan is not coping; the CPU throttles at 85 °C</w:t>
             </w:r>
           </w:p>
         </w:tc>
@@ -1121,8 +1121,8 @@
       <w:tr>
         <w:tc>
           <w:tcPr>
-            <w:tcW w:type="dxa" w:w="2046"/>
-            <w:tcW w:type="dxa" w:w="2046"/>
+            <w:tcW w:type="dxa" w:w="2009"/>
+            <w:tcW w:type="dxa" w:w="2009"/>
           </w:tcPr>
           <w:p>
             <w:r>
@@ -1136,8 +1136,8 @@
         </w:tc>
         <w:tc>
           <w:tcPr>
-            <w:tcW w:type="dxa" w:w="2611"/>
-            <w:tcW w:type="dxa" w:w="2611"/>
+            <w:tcW w:type="dxa" w:w="2537"/>
+            <w:tcW w:type="dxa" w:w="2537"/>
           </w:tcPr>
           <w:p>
             <w:r>
@@ -1150,8 +1150,8 @@
         </w:tc>
         <w:tc>
           <w:tcPr>
-            <w:tcW w:type="dxa" w:w="2418"/>
-            <w:tcW w:type="dxa" w:w="2418"/>
+            <w:tcW w:type="dxa" w:w="2411"/>
+            <w:tcW w:type="dxa" w:w="2411"/>
           </w:tcPr>
           <w:p>
             <w:r>
@@ -1164,8 +1164,8 @@
         </w:tc>
         <w:tc>
           <w:tcPr>
-            <w:tcW w:type="dxa" w:w="2283"/>
-            <w:tcW w:type="dxa" w:w="2283"/>
+            <w:tcW w:type="dxa" w:w="2401"/>
+            <w:tcW w:type="dxa" w:w="2401"/>
           </w:tcPr>
           <w:p>
             <w:r>
@@ -1180,8 +1180,8 @@
       <w:tr>
         <w:tc>
           <w:tcPr>
-            <w:tcW w:type="dxa" w:w="2046"/>
-            <w:tcW w:type="dxa" w:w="2046"/>
+            <w:tcW w:type="dxa" w:w="2009"/>
+            <w:tcW w:type="dxa" w:w="2009"/>
           </w:tcPr>
           <w:p>
             <w:r>
@@ -1195,8 +1195,8 @@
         </w:tc>
         <w:tc>
           <w:tcPr>
-            <w:tcW w:type="dxa" w:w="2611"/>
-            <w:tcW w:type="dxa" w:w="2611"/>
+            <w:tcW w:type="dxa" w:w="2537"/>
+            <w:tcW w:type="dxa" w:w="2537"/>
           </w:tcPr>
           <w:p>
             <w:r>
@@ -1209,8 +1209,8 @@
         </w:tc>
         <w:tc>
           <w:tcPr>
-            <w:tcW w:type="dxa" w:w="2418"/>
-            <w:tcW w:type="dxa" w:w="2418"/>
+            <w:tcW w:type="dxa" w:w="2411"/>
+            <w:tcW w:type="dxa" w:w="2411"/>
           </w:tcPr>
           <w:p>
             <w:r>
@@ -1223,8 +1223,8 @@
         </w:tc>
         <w:tc>
           <w:tcPr>
-            <w:tcW w:type="dxa" w:w="2283"/>
-            <w:tcW w:type="dxa" w:w="2283"/>
+            <w:tcW w:type="dxa" w:w="2401"/>
+            <w:tcW w:type="dxa" w:w="2401"/>
           </w:tcPr>
           <w:p>
             <w:r>
@@ -1232,6 +1232,242 @@
                 <w:sz w:val="20"/>
               </w:rPr>
               <w:t>it goes up</w:t>
+            </w:r>
+          </w:p>
+        </w:tc>
+      </w:tr>
+      <w:tr>
+        <w:tc>
+          <w:tcPr>
+            <w:tcW w:type="dxa" w:w="2009"/>
+            <w:tcW w:type="dxa" w:w="2009"/>
+          </w:tcPr>
+          <w:p>
+            <w:r>
+              <w:rPr>
+                <w:rFonts w:ascii="Consolas" w:hAnsi="Consolas"/>
+                <w:sz w:val="20"/>
+              </w:rPr>
+              <w:t>.15.0</w:t>
+            </w:r>
+          </w:p>
+        </w:tc>
+        <w:tc>
+          <w:tcPr>
+            <w:tcW w:type="dxa" w:w="2537"/>
+            <w:tcW w:type="dxa" w:w="2537"/>
+          </w:tcPr>
+          <w:p>
+            <w:r>
+              <w:rPr>
+                <w:sz w:val="20"/>
+              </w:rPr>
+              <w:t>lynxFanPercent</w:t>
+            </w:r>
+          </w:p>
+        </w:tc>
+        <w:tc>
+          <w:tcPr>
+            <w:tcW w:type="dxa" w:w="2411"/>
+            <w:tcW w:type="dxa" w:w="2411"/>
+          </w:tcPr>
+          <w:p>
+            <w:r>
+              <w:rPr>
+                <w:sz w:val="20"/>
+              </w:rPr>
+              <w:t>fan speed, % (0 off, 50 slowest, 100 full)</w:t>
+            </w:r>
+          </w:p>
+        </w:tc>
+        <w:tc>
+          <w:tcPr>
+            <w:tcW w:type="dxa" w:w="2401"/>
+            <w:tcW w:type="dxa" w:w="2401"/>
+          </w:tcPr>
+          <w:p>
+            <w:r>
+              <w:rPr>
+                <w:sz w:val="20"/>
+              </w:rPr>
+              <w:t>100 while the temperature is normal: the fan control has stopped</w:t>
+            </w:r>
+          </w:p>
+        </w:tc>
+      </w:tr>
+      <w:tr>
+        <w:tc>
+          <w:tcPr>
+            <w:tcW w:type="dxa" w:w="2009"/>
+            <w:tcW w:type="dxa" w:w="2009"/>
+          </w:tcPr>
+          <w:p>
+            <w:r>
+              <w:rPr>
+                <w:rFonts w:ascii="Consolas" w:hAnsi="Consolas"/>
+                <w:sz w:val="20"/>
+              </w:rPr>
+              <w:t>.16.0</w:t>
+            </w:r>
+          </w:p>
+        </w:tc>
+        <w:tc>
+          <w:tcPr>
+            <w:tcW w:type="dxa" w:w="2537"/>
+            <w:tcW w:type="dxa" w:w="2537"/>
+          </w:tcPr>
+          <w:p>
+            <w:r>
+              <w:rPr>
+                <w:sz w:val="20"/>
+              </w:rPr>
+              <w:t>lynxUptime</w:t>
+            </w:r>
+          </w:p>
+        </w:tc>
+        <w:tc>
+          <w:tcPr>
+            <w:tcW w:type="dxa" w:w="2411"/>
+            <w:tcW w:type="dxa" w:w="2411"/>
+          </w:tcPr>
+          <w:p>
+            <w:r>
+              <w:rPr>
+                <w:sz w:val="20"/>
+              </w:rPr>
+              <w:t>seconds since the ROCK started</w:t>
+            </w:r>
+          </w:p>
+        </w:tc>
+        <w:tc>
+          <w:tcPr>
+            <w:tcW w:type="dxa" w:w="2401"/>
+            <w:tcW w:type="dxa" w:w="2401"/>
+          </w:tcPr>
+          <w:p>
+            <w:r>
+              <w:rPr>
+                <w:sz w:val="20"/>
+              </w:rPr>
+              <w:t>it drops: the ROCK restarted</w:t>
+            </w:r>
+          </w:p>
+        </w:tc>
+      </w:tr>
+      <w:tr>
+        <w:tc>
+          <w:tcPr>
+            <w:tcW w:type="dxa" w:w="2009"/>
+            <w:tcW w:type="dxa" w:w="2009"/>
+          </w:tcPr>
+          <w:p>
+            <w:r>
+              <w:rPr>
+                <w:rFonts w:ascii="Consolas" w:hAnsi="Consolas"/>
+                <w:sz w:val="20"/>
+              </w:rPr>
+              <w:t>.17.0</w:t>
+            </w:r>
+          </w:p>
+        </w:tc>
+        <w:tc>
+          <w:tcPr>
+            <w:tcW w:type="dxa" w:w="2537"/>
+            <w:tcW w:type="dxa" w:w="2537"/>
+          </w:tcPr>
+          <w:p>
+            <w:r>
+              <w:rPr>
+                <w:sz w:val="20"/>
+              </w:rPr>
+              <w:t>lynxCpuLoad</w:t>
+            </w:r>
+          </w:p>
+        </w:tc>
+        <w:tc>
+          <w:tcPr>
+            <w:tcW w:type="dxa" w:w="2411"/>
+            <w:tcW w:type="dxa" w:w="2411"/>
+          </w:tcPr>
+          <w:p>
+            <w:r>
+              <w:rPr>
+                <w:sz w:val="20"/>
+              </w:rPr>
+              <w:t>one-minute load, % of all cores (about 20 on air at 4K)</w:t>
+            </w:r>
+          </w:p>
+        </w:tc>
+        <w:tc>
+          <w:tcPr>
+            <w:tcW w:type="dxa" w:w="2401"/>
+            <w:tcW w:type="dxa" w:w="2401"/>
+          </w:tcPr>
+          <w:p>
+            <w:r>
+              <w:rPr>
+                <w:sz w:val="20"/>
+              </w:rPr>
+              <w:t>80 or more for 10 minutes</w:t>
+            </w:r>
+          </w:p>
+        </w:tc>
+      </w:tr>
+      <w:tr>
+        <w:tc>
+          <w:tcPr>
+            <w:tcW w:type="dxa" w:w="2009"/>
+            <w:tcW w:type="dxa" w:w="2009"/>
+          </w:tcPr>
+          <w:p>
+            <w:r>
+              <w:rPr>
+                <w:rFonts w:ascii="Consolas" w:hAnsi="Consolas"/>
+                <w:sz w:val="20"/>
+              </w:rPr>
+              <w:t>.18.0</w:t>
+            </w:r>
+          </w:p>
+        </w:tc>
+        <w:tc>
+          <w:tcPr>
+            <w:tcW w:type="dxa" w:w="2537"/>
+            <w:tcW w:type="dxa" w:w="2537"/>
+          </w:tcPr>
+          <w:p>
+            <w:r>
+              <w:rPr>
+                <w:sz w:val="20"/>
+              </w:rPr>
+              <w:t>lynxDiskFreeMB</w:t>
+            </w:r>
+          </w:p>
+        </w:tc>
+        <w:tc>
+          <w:tcPr>
+            <w:tcW w:type="dxa" w:w="2411"/>
+            <w:tcW w:type="dxa" w:w="2411"/>
+          </w:tcPr>
+          <w:p>
+            <w:r>
+              <w:rPr>
+                <w:sz w:val="20"/>
+              </w:rPr>
+              <w:t>free space on the system drive, MB</w:t>
+            </w:r>
+          </w:p>
+        </w:tc>
+        <w:tc>
+          <w:tcPr>
+            <w:tcW w:type="dxa" w:w="2401"/>
+            <w:tcW w:type="dxa" w:w="2401"/>
+          </w:tcPr>
+          <w:p>
+            <w:r>
+              <w:rPr>
+                <w:sz w:val="20"/>
+              </w:rPr>
+              <w:t>below 2000</w:t>
             </w:r>
           </w:p>
         </w:tc>
@@ -1386,7 +1622,7 @@
       </w:pPr>
       <w:r>
         <w:rPr/>
-        <w:t xml:space="preserve">Fourteen lines, by number. Debian's </w:t>
+        <w:t xml:space="preserve">Eighteen lines, by number. Debian's </w:t>
       </w:r>
       <w:r>
         <w:rPr>
@@ -1797,6 +2033,306 @@
           <w:sz w:val="20"/>
         </w:rPr>
         <w:t xml:space="preserve">    value_template: "{{ (value | int / 10) | round(1) }}"</w:t>
+        <w:br/>
+      </w:r>
+      <w:r>
+        <w:rPr>
+          <w:rFonts w:ascii="Consolas" w:hAnsi="Consolas"/>
+          <w:sz w:val="20"/>
+        </w:rPr>
+        <w:br/>
+      </w:r>
+      <w:r>
+        <w:rPr>
+          <w:rFonts w:ascii="Consolas" w:hAnsi="Consolas"/>
+          <w:sz w:val="20"/>
+        </w:rPr>
+        <w:t xml:space="preserve">  - platform: snmp</w:t>
+        <w:br/>
+      </w:r>
+      <w:r>
+        <w:rPr>
+          <w:rFonts w:ascii="Consolas" w:hAnsi="Consolas"/>
+          <w:sz w:val="20"/>
+        </w:rPr>
+        <w:t xml:space="preserve">    name: Lynx-Tx ROCK fan</w:t>
+        <w:br/>
+      </w:r>
+      <w:r>
+        <w:rPr>
+          <w:rFonts w:ascii="Consolas" w:hAnsi="Consolas"/>
+          <w:sz w:val="20"/>
+        </w:rPr>
+        <w:t xml:space="preserve">    unique_id: lynx_tx_fan</w:t>
+        <w:br/>
+      </w:r>
+      <w:r>
+        <w:rPr>
+          <w:rFonts w:ascii="Consolas" w:hAnsi="Consolas"/>
+          <w:sz w:val="20"/>
+        </w:rPr>
+        <w:t xml:space="preserve">    host: 192.168.0.50</w:t>
+        <w:br/>
+      </w:r>
+      <w:r>
+        <w:rPr>
+          <w:rFonts w:ascii="Consolas" w:hAnsi="Consolas"/>
+          <w:sz w:val="20"/>
+        </w:rPr>
+        <w:t xml:space="preserve">    community: lynx</w:t>
+        <w:br/>
+      </w:r>
+      <w:r>
+        <w:rPr>
+          <w:rFonts w:ascii="Consolas" w:hAnsi="Consolas"/>
+          <w:sz w:val="20"/>
+        </w:rPr>
+        <w:t xml:space="preserve">    version: "2c"</w:t>
+        <w:br/>
+      </w:r>
+      <w:r>
+        <w:rPr>
+          <w:rFonts w:ascii="Consolas" w:hAnsi="Consolas"/>
+          <w:sz w:val="20"/>
+        </w:rPr>
+        <w:t xml:space="preserve">    baseoid: 1.3.6.1.4.1.8072.9999.1.1.15.0</w:t>
+        <w:br/>
+      </w:r>
+      <w:r>
+        <w:rPr>
+          <w:rFonts w:ascii="Consolas" w:hAnsi="Consolas"/>
+          <w:sz w:val="20"/>
+        </w:rPr>
+        <w:t xml:space="preserve">    unit_of_measurement: "%"</w:t>
+        <w:br/>
+      </w:r>
+      <w:r>
+        <w:rPr>
+          <w:rFonts w:ascii="Consolas" w:hAnsi="Consolas"/>
+          <w:sz w:val="20"/>
+        </w:rPr>
+        <w:br/>
+      </w:r>
+      <w:r>
+        <w:rPr>
+          <w:rFonts w:ascii="Consolas" w:hAnsi="Consolas"/>
+          <w:sz w:val="20"/>
+        </w:rPr>
+        <w:t xml:space="preserve">  - platform: snmp</w:t>
+        <w:br/>
+      </w:r>
+      <w:r>
+        <w:rPr>
+          <w:rFonts w:ascii="Consolas" w:hAnsi="Consolas"/>
+          <w:sz w:val="20"/>
+        </w:rPr>
+        <w:t xml:space="preserve">    name: Lynx-Tx ROCK uptime</w:t>
+        <w:br/>
+      </w:r>
+      <w:r>
+        <w:rPr>
+          <w:rFonts w:ascii="Consolas" w:hAnsi="Consolas"/>
+          <w:sz w:val="20"/>
+        </w:rPr>
+        <w:t xml:space="preserve">    unique_id: lynx_tx_uptime</w:t>
+        <w:br/>
+      </w:r>
+      <w:r>
+        <w:rPr>
+          <w:rFonts w:ascii="Consolas" w:hAnsi="Consolas"/>
+          <w:sz w:val="20"/>
+        </w:rPr>
+        <w:t xml:space="preserve">    host: 192.168.0.50</w:t>
+        <w:br/>
+      </w:r>
+      <w:r>
+        <w:rPr>
+          <w:rFonts w:ascii="Consolas" w:hAnsi="Consolas"/>
+          <w:sz w:val="20"/>
+        </w:rPr>
+        <w:t xml:space="preserve">    community: lynx</w:t>
+        <w:br/>
+      </w:r>
+      <w:r>
+        <w:rPr>
+          <w:rFonts w:ascii="Consolas" w:hAnsi="Consolas"/>
+          <w:sz w:val="20"/>
+        </w:rPr>
+        <w:t xml:space="preserve">    version: "2c"</w:t>
+        <w:br/>
+      </w:r>
+      <w:r>
+        <w:rPr>
+          <w:rFonts w:ascii="Consolas" w:hAnsi="Consolas"/>
+          <w:sz w:val="20"/>
+        </w:rPr>
+        <w:t xml:space="preserve">    baseoid: 1.3.6.1.4.1.8072.9999.1.1.16.0</w:t>
+        <w:br/>
+      </w:r>
+      <w:r>
+        <w:rPr>
+          <w:rFonts w:ascii="Consolas" w:hAnsi="Consolas"/>
+          <w:sz w:val="20"/>
+        </w:rPr>
+        <w:t xml:space="preserve">    unit_of_measurement: "h"</w:t>
+        <w:br/>
+      </w:r>
+      <w:r>
+        <w:rPr>
+          <w:rFonts w:ascii="Consolas" w:hAnsi="Consolas"/>
+          <w:sz w:val="20"/>
+        </w:rPr>
+        <w:t xml:space="preserve">    value_template: "{{ (value | int / 3600) | round(1) }}"</w:t>
+        <w:br/>
+      </w:r>
+      <w:r>
+        <w:rPr>
+          <w:rFonts w:ascii="Consolas" w:hAnsi="Consolas"/>
+          <w:sz w:val="20"/>
+        </w:rPr>
+        <w:br/>
+      </w:r>
+      <w:r>
+        <w:rPr>
+          <w:rFonts w:ascii="Consolas" w:hAnsi="Consolas"/>
+          <w:sz w:val="20"/>
+        </w:rPr>
+        <w:t xml:space="preserve">  - platform: snmp</w:t>
+        <w:br/>
+      </w:r>
+      <w:r>
+        <w:rPr>
+          <w:rFonts w:ascii="Consolas" w:hAnsi="Consolas"/>
+          <w:sz w:val="20"/>
+        </w:rPr>
+        <w:t xml:space="preserve">    name: Lynx-Tx ROCK load</w:t>
+        <w:br/>
+      </w:r>
+      <w:r>
+        <w:rPr>
+          <w:rFonts w:ascii="Consolas" w:hAnsi="Consolas"/>
+          <w:sz w:val="20"/>
+        </w:rPr>
+        <w:t xml:space="preserve">    unique_id: lynx_tx_load</w:t>
+        <w:br/>
+      </w:r>
+      <w:r>
+        <w:rPr>
+          <w:rFonts w:ascii="Consolas" w:hAnsi="Consolas"/>
+          <w:sz w:val="20"/>
+        </w:rPr>
+        <w:t xml:space="preserve">    host: 192.168.0.50</w:t>
+        <w:br/>
+      </w:r>
+      <w:r>
+        <w:rPr>
+          <w:rFonts w:ascii="Consolas" w:hAnsi="Consolas"/>
+          <w:sz w:val="20"/>
+        </w:rPr>
+        <w:t xml:space="preserve">    community: lynx</w:t>
+        <w:br/>
+      </w:r>
+      <w:r>
+        <w:rPr>
+          <w:rFonts w:ascii="Consolas" w:hAnsi="Consolas"/>
+          <w:sz w:val="20"/>
+        </w:rPr>
+        <w:t xml:space="preserve">    version: "2c"</w:t>
+        <w:br/>
+      </w:r>
+      <w:r>
+        <w:rPr>
+          <w:rFonts w:ascii="Consolas" w:hAnsi="Consolas"/>
+          <w:sz w:val="20"/>
+        </w:rPr>
+        <w:t xml:space="preserve">    baseoid: 1.3.6.1.4.1.8072.9999.1.1.17.0</w:t>
+        <w:br/>
+      </w:r>
+      <w:r>
+        <w:rPr>
+          <w:rFonts w:ascii="Consolas" w:hAnsi="Consolas"/>
+          <w:sz w:val="20"/>
+        </w:rPr>
+        <w:t xml:space="preserve">    unit_of_measurement: "%"</w:t>
+        <w:br/>
+      </w:r>
+      <w:r>
+        <w:rPr>
+          <w:rFonts w:ascii="Consolas" w:hAnsi="Consolas"/>
+          <w:sz w:val="20"/>
+        </w:rPr>
+        <w:br/>
+      </w:r>
+      <w:r>
+        <w:rPr>
+          <w:rFonts w:ascii="Consolas" w:hAnsi="Consolas"/>
+          <w:sz w:val="20"/>
+        </w:rPr>
+        <w:t xml:space="preserve">  - platform: snmp</w:t>
+        <w:br/>
+      </w:r>
+      <w:r>
+        <w:rPr>
+          <w:rFonts w:ascii="Consolas" w:hAnsi="Consolas"/>
+          <w:sz w:val="20"/>
+        </w:rPr>
+        <w:t xml:space="preserve">    name: Lynx-Tx ROCK free space</w:t>
+        <w:br/>
+      </w:r>
+      <w:r>
+        <w:rPr>
+          <w:rFonts w:ascii="Consolas" w:hAnsi="Consolas"/>
+          <w:sz w:val="20"/>
+        </w:rPr>
+        <w:t xml:space="preserve">    unique_id: lynx_tx_disk_free</w:t>
+        <w:br/>
+      </w:r>
+      <w:r>
+        <w:rPr>
+          <w:rFonts w:ascii="Consolas" w:hAnsi="Consolas"/>
+          <w:sz w:val="20"/>
+        </w:rPr>
+        <w:t xml:space="preserve">    host: 192.168.0.50</w:t>
+        <w:br/>
+      </w:r>
+      <w:r>
+        <w:rPr>
+          <w:rFonts w:ascii="Consolas" w:hAnsi="Consolas"/>
+          <w:sz w:val="20"/>
+        </w:rPr>
+        <w:t xml:space="preserve">    community: lynx</w:t>
+        <w:br/>
+      </w:r>
+      <w:r>
+        <w:rPr>
+          <w:rFonts w:ascii="Consolas" w:hAnsi="Consolas"/>
+          <w:sz w:val="20"/>
+        </w:rPr>
+        <w:t xml:space="preserve">    version: "2c"</w:t>
+        <w:br/>
+      </w:r>
+      <w:r>
+        <w:rPr>
+          <w:rFonts w:ascii="Consolas" w:hAnsi="Consolas"/>
+          <w:sz w:val="20"/>
+        </w:rPr>
+        <w:t xml:space="preserve">    baseoid: 1.3.6.1.4.1.8072.9999.1.1.18.0</w:t>
+        <w:br/>
+      </w:r>
+      <w:r>
+        <w:rPr>
+          <w:rFonts w:ascii="Consolas" w:hAnsi="Consolas"/>
+          <w:sz w:val="20"/>
+        </w:rPr>
+        <w:t xml:space="preserve">    unit_of_measurement: "GB"</w:t>
+        <w:br/>
+      </w:r>
+      <w:r>
+        <w:rPr>
+          <w:rFonts w:ascii="Consolas" w:hAnsi="Consolas"/>
+          <w:sz w:val="20"/>
+        </w:rPr>
+        <w:t xml:space="preserve">    value_template: "{{ (value | int / 1024) | round(1) }}"</w:t>
       </w:r>
     </w:p>
     <w:p>
@@ -1973,6 +2509,94 @@
           <w:rFonts w:ascii="Consolas" w:hAnsi="Consolas"/>
           <w:sz w:val="20"/>
         </w:rPr>
+        <w:t xml:space="preserve">    - platform: numeric_state</w:t>
+        <w:br/>
+      </w:r>
+      <w:r>
+        <w:rPr>
+          <w:rFonts w:ascii="Consolas" w:hAnsi="Consolas"/>
+          <w:sz w:val="20"/>
+        </w:rPr>
+        <w:t xml:space="preserve">      entity_id: sensor.lynx_tx_rock_temperature</w:t>
+        <w:br/>
+      </w:r>
+      <w:r>
+        <w:rPr>
+          <w:rFonts w:ascii="Consolas" w:hAnsi="Consolas"/>
+          <w:sz w:val="20"/>
+        </w:rPr>
+        <w:t xml:space="preserve">      above: 60</w:t>
+        <w:br/>
+      </w:r>
+      <w:r>
+        <w:rPr>
+          <w:rFonts w:ascii="Consolas" w:hAnsi="Consolas"/>
+          <w:sz w:val="20"/>
+        </w:rPr>
+        <w:t xml:space="preserve">      for: "00:05:00"</w:t>
+        <w:br/>
+      </w:r>
+      <w:r>
+        <w:rPr>
+          <w:rFonts w:ascii="Consolas" w:hAnsi="Consolas"/>
+          <w:sz w:val="20"/>
+        </w:rPr>
+        <w:t xml:space="preserve">    - platform: numeric_state</w:t>
+        <w:br/>
+      </w:r>
+      <w:r>
+        <w:rPr>
+          <w:rFonts w:ascii="Consolas" w:hAnsi="Consolas"/>
+          <w:sz w:val="20"/>
+        </w:rPr>
+        <w:t xml:space="preserve">      entity_id: sensor.lynx_tx_rock_free_space</w:t>
+        <w:br/>
+      </w:r>
+      <w:r>
+        <w:rPr>
+          <w:rFonts w:ascii="Consolas" w:hAnsi="Consolas"/>
+          <w:sz w:val="20"/>
+        </w:rPr>
+        <w:t xml:space="preserve">      below: 2</w:t>
+        <w:br/>
+      </w:r>
+      <w:r>
+        <w:rPr>
+          <w:rFonts w:ascii="Consolas" w:hAnsi="Consolas"/>
+          <w:sz w:val="20"/>
+        </w:rPr>
+        <w:t xml:space="preserve">    - platform: numeric_state</w:t>
+        <w:br/>
+      </w:r>
+      <w:r>
+        <w:rPr>
+          <w:rFonts w:ascii="Consolas" w:hAnsi="Consolas"/>
+          <w:sz w:val="20"/>
+        </w:rPr>
+        <w:t xml:space="preserve">      entity_id: sensor.lynx_tx_rock_load</w:t>
+        <w:br/>
+      </w:r>
+      <w:r>
+        <w:rPr>
+          <w:rFonts w:ascii="Consolas" w:hAnsi="Consolas"/>
+          <w:sz w:val="20"/>
+        </w:rPr>
+        <w:t xml:space="preserve">      above: 80</w:t>
+        <w:br/>
+      </w:r>
+      <w:r>
+        <w:rPr>
+          <w:rFonts w:ascii="Consolas" w:hAnsi="Consolas"/>
+          <w:sz w:val="20"/>
+        </w:rPr>
+        <w:t xml:space="preserve">      for: "00:10:00"</w:t>
+        <w:br/>
+      </w:r>
+      <w:r>
+        <w:rPr>
+          <w:rFonts w:ascii="Consolas" w:hAnsi="Consolas"/>
+          <w:sz w:val="20"/>
+        </w:rPr>
         <w:t xml:space="preserve">  action:</w:t>
         <w:br/>
       </w:r>
@@ -2024,7 +2648,7 @@
       </w:r>
       <w:r>
         <w:rPr/>
-        <w:t xml:space="preserve"> delays stop a momentary blip from waking you: an alarm has to hold for that long before it is sent. Muted and fault wait 90 seconds, long enough for auto-recover to put it right by itself; lockout is sent at once, because it needs you.</w:t>
+        <w:t xml:space="preserve"> delays stop a momentary blip from waking you: an alarm has to hold for that long before it is sent. Muted and fault wait 90 seconds, long enough for auto-recover to put it right by itself; lockout is sent at once, because it needs you. The ROCK's own health alarms wait longer: a hot spell of five minutes, or ten minutes flat out, before they bother you.</w:t>
       </w:r>
     </w:p>
     <w:p>
@@ -2050,9 +2674,9 @@
         </w:tblBorders>
       </w:tblPr>
       <w:tblGrid>
-        <w:gridCol w:w="1379"/>
-        <w:gridCol w:w="1625"/>
-        <w:gridCol w:w="6354"/>
+        <w:gridCol w:w="1312"/>
+        <w:gridCol w:w="1786"/>
+        <w:gridCol w:w="6261"/>
       </w:tblGrid>
       <w:tr>
         <w:trPr>
@@ -2060,8 +2684,8 @@
         </w:trPr>
         <w:tc>
           <w:tcPr>
-            <w:tcW w:type="dxa" w:w="1379"/>
-            <w:tcW w:type="dxa" w:w="1379"/>
+            <w:tcW w:type="dxa" w:w="1312"/>
+            <w:tcW w:type="dxa" w:w="1312"/>
             <w:shd w:fill="2C3E50" w:val="clear"/>
           </w:tcPr>
           <w:p>
@@ -2077,8 +2701,8 @@
         </w:tc>
         <w:tc>
           <w:tcPr>
-            <w:tcW w:type="dxa" w:w="1625"/>
-            <w:tcW w:type="dxa" w:w="1625"/>
+            <w:tcW w:type="dxa" w:w="1786"/>
+            <w:tcW w:type="dxa" w:w="1786"/>
             <w:shd w:fill="2C3E50" w:val="clear"/>
           </w:tcPr>
           <w:p>
@@ -2094,8 +2718,8 @@
         </w:tc>
         <w:tc>
           <w:tcPr>
-            <w:tcW w:type="dxa" w:w="6354"/>
-            <w:tcW w:type="dxa" w:w="6354"/>
+            <w:tcW w:type="dxa" w:w="6261"/>
+            <w:tcW w:type="dxa" w:w="6261"/>
             <w:shd w:fill="2C3E50" w:val="clear"/>
           </w:tcPr>
           <w:p>
@@ -2113,8 +2737,8 @@
       <w:tr>
         <w:tc>
           <w:tcPr>
-            <w:tcW w:type="dxa" w:w="1379"/>
-            <w:tcW w:type="dxa" w:w="1379"/>
+            <w:tcW w:type="dxa" w:w="1312"/>
+            <w:tcW w:type="dxa" w:w="1312"/>
           </w:tcPr>
           <w:p>
             <w:r>
@@ -2127,8 +2751,8 @@
         </w:tc>
         <w:tc>
           <w:tcPr>
-            <w:tcW w:type="dxa" w:w="1625"/>
-            <w:tcW w:type="dxa" w:w="1625"/>
+            <w:tcW w:type="dxa" w:w="1786"/>
+            <w:tcW w:type="dxa" w:w="1786"/>
           </w:tcPr>
           <w:p>
             <w:r>
@@ -2141,8 +2765,8 @@
         </w:tc>
         <w:tc>
           <w:tcPr>
-            <w:tcW w:type="dxa" w:w="6354"/>
-            <w:tcW w:type="dxa" w:w="6354"/>
+            <w:tcW w:type="dxa" w:w="6261"/>
+            <w:tcW w:type="dxa" w:w="6261"/>
           </w:tcPr>
           <w:p>
             <w:r>
@@ -2150,6 +2774,50 @@
                 <w:sz w:val="20"/>
               </w:rPr>
               <w:t>First edition, from the Markdown page: SNMP objects, auto-recover and lockout, Home Assistant sensors and alarm</w:t>
+            </w:r>
+          </w:p>
+        </w:tc>
+      </w:tr>
+      <w:tr>
+        <w:tc>
+          <w:tcPr>
+            <w:tcW w:type="dxa" w:w="1312"/>
+            <w:tcW w:type="dxa" w:w="1312"/>
+          </w:tcPr>
+          <w:p>
+            <w:r>
+              <w:rPr>
+                <w:sz w:val="20"/>
+              </w:rPr>
+              <w:t>1.1</w:t>
+            </w:r>
+          </w:p>
+        </w:tc>
+        <w:tc>
+          <w:tcPr>
+            <w:tcW w:type="dxa" w:w="1786"/>
+            <w:tcW w:type="dxa" w:w="1786"/>
+          </w:tcPr>
+          <w:p>
+            <w:r>
+              <w:rPr>
+                <w:sz w:val="20"/>
+              </w:rPr>
+              <w:t>23 October 2026</w:t>
+            </w:r>
+          </w:p>
+        </w:tc>
+        <w:tc>
+          <w:tcPr>
+            <w:tcW w:type="dxa" w:w="6261"/>
+            <w:tcW w:type="dxa" w:w="6261"/>
+          </w:tcPr>
+          <w:p>
+            <w:r>
+              <w:rPr>
+                <w:sz w:val="20"/>
+              </w:rPr>
+              <w:t>The ROCK's own health: fan speed, uptime, load and free space (objects 15 to 18), with Home Assistant sensors and alarms</w:t>
             </w:r>
           </w:p>
         </w:tc>

</xml_diff>